<commit_message>
Sync the stated word count in the submission sheet
Co-Authored-By: Claude Opus 5 <noreply@anthropic.com>
Claude-Session: https://claude.ai/code/session_013TkounLTBFVQRstE3VnhkM
</commit_message>
<xml_diff>
--- a/投稿操作单_InsightsIntoImaging.docx
+++ b/投稿操作单_InsightsIntoImaging.docx
@@ -107,7 +107,7 @@
         <w:spacing w:after="160"/>
       </w:pPr>
       <w:r>
-        <w:t>2,997 词，含 4 表 3 图（图已内嵌便于评审阅读）。文中无任何作者身份信息。</w:t>
+        <w:t>2,998 词，含 4 表 3 图（图已内嵌便于评审阅读）。文中无任何作者身份信息。</w:t>
       </w:r>
     </w:p>
     <w:p>
@@ -498,7 +498,7 @@
         <w:spacing w:after="160"/>
       </w:pPr>
       <w:r>
-        <w:t>2. 正文 2,997 词，未超 3,000 上限。</w:t>
+        <w:t>2. 正文 2,998 词，未超 3,000 上限。</w:t>
       </w:r>
     </w:p>
     <w:p>

</xml_diff>